<commit_message>
docs: align LR1 branch strategy with lab workflow
</commit_message>
<xml_diff>
--- a/docs/reports/ЛР1, Первухин Роман, 241-3211.docx
+++ b/docs/reports/ЛР1, Первухин Роман, 241-3211.docx
@@ -9329,53 +9329,32 @@
         <w:jc w:val="both"/>
       </w:pPr>
       <w:r>
-        <w:t xml:space="preserve">SW-09 – </w:t>
-      </w:r>
-      <w:r>
-        <w:rPr>
-          <w:lang w:val="ru-RU"/>
-        </w:rPr>
-        <w:t>используется</w:t>
-      </w:r>
-      <w:r>
-        <w:t xml:space="preserve"> </w:t>
-      </w:r>
-      <w:r>
-        <w:rPr>
-          <w:lang w:val="ru-RU"/>
-        </w:rPr>
-        <w:t>модель</w:t>
-      </w:r>
-      <w:r>
-        <w:t xml:space="preserve"> </w:t>
-      </w:r>
-      <w:r>
-        <w:rPr>
-          <w:lang w:val="ru-RU"/>
-        </w:rPr>
-        <w:t>ветвления</w:t>
-      </w:r>
-      <w:r>
-        <w:t xml:space="preserve"> Git: main </w:t>
-      </w:r>
-      <w:r>
-        <w:t>–</w:t>
-      </w:r>
-      <w:r>
-        <w:t xml:space="preserve"> prod, release/* </w:t>
-      </w:r>
-      <w:r>
-        <w:t>–</w:t>
-      </w:r>
-      <w:r>
-        <w:t xml:space="preserve"> stage, develop </w:t>
-      </w:r>
-      <w:r>
-        <w:t>–</w:t>
-      </w:r>
-      <w:r>
-        <w:t xml:space="preserve"> test.</w:t>
-      </w:r>
+        <w:t>SW-09 – ветки Git: dev – интеграция и развёртывание на STAGE; prod – выпуск проверенной версии на PROD. Временные ветки кода, конфигурации и документации создаются от dev. Слияние в dev и перенос dev → prod выполняются через PR после CI и согласования другим участником. Сборка и проверки выполняются на TEST.</w:t>
+      </w:r>
+      <w:r>
+        <w:rPr>
+          <w:lang w:val="ru-RU"/>
+        </w:rPr>
+      </w:r>
+      <w:r/>
+      <w:r>
+        <w:rPr>
+          <w:lang w:val="ru-RU"/>
+        </w:rPr>
+      </w:r>
+      <w:r/>
+      <w:r>
+        <w:rPr>
+          <w:lang w:val="ru-RU"/>
+        </w:rPr>
+      </w:r>
+      <w:r/>
+      <w:r/>
+      <w:r/>
+      <w:r/>
+      <w:r/>
+      <w:r/>
+      <w:r/>
     </w:p>
     <w:p>
       <w:pPr>

</xml_diff>